<commit_message>
Convert equations to Word OMML math objects; fix fig1(c) label σ=0.8θ→σ=θ
- Replace all 9 plain-text equations with proper Word equation objects (OMML)
  using lxml-based XML construction (fractions, subscripts, superscripts,
  hat accents, delimiters)
- Fix sr_simulation.py fig1 panel (c) title: σ=0.8θ was wrong since
  sigma_base=0.8 and theta_val=0.8, so actual ratio is σ=θ

Co-Authored-By: Tatsuki Onishi <bougtoir@gmail.com>
</commit_message>
<xml_diff>
--- a/dvs_noise_inverse_problem/jatis_submission/manuscript_jatis.docx
+++ b/dvs_noise_inverse_problem/jatis_submission/manuscript_jatis.docx
@@ -253,10 +253,107 @@
     </w:p>
     <w:p>
       <w:pPr>
-        <w:spacing w:after="120" w:before="120"/>
+        <w:spacing w:before="160" w:after="160"/>
       </w:pPr>
+      <m:oMathPara>
+        <m:oMath>
+          <m:sSub>
+            <m:e>
+              <m:r>
+                <m:t xml:space="preserve">λ</m:t>
+              </m:r>
+            </m:e>
+            <m:sub>
+              <m:r>
+                <m:t xml:space="preserve">noise</m:t>
+              </m:r>
+            </m:sub>
+          </m:sSub>
+          <m:d>
+            <m:dPr>
+              <m:begChr m:val="("/>
+              <m:endChr m:val=")"/>
+            </m:dPr>
+            <m:e>
+              <m:r>
+                <m:t xml:space="preserve">T, </m:t>
+              </m:r>
+              <m:sSub>
+                <m:e>
+                  <m:r>
+                    <m:t xml:space="preserve">I</m:t>
+                  </m:r>
+                </m:e>
+                <m:sub>
+                  <m:r>
+                    <m:t xml:space="preserve">bg</m:t>
+                  </m:r>
+                </m:sub>
+              </m:sSub>
+            </m:e>
+          </m:d>
+          <m:r>
+            <m:t xml:space="preserve"> = </m:t>
+          </m:r>
+          <m:sSub>
+            <m:e>
+              <m:r>
+                <m:t xml:space="preserve">I</m:t>
+              </m:r>
+            </m:e>
+            <m:sub>
+              <m:r>
+                <m:t xml:space="preserve">dark,ref</m:t>
+              </m:r>
+            </m:sub>
+          </m:sSub>
+          <m:r>
+            <m:t xml:space="preserve"> ⋅ exp</m:t>
+          </m:r>
+          <m:d>
+            <m:dPr>
+              <m:begChr m:val="("/>
+              <m:endChr m:val=")"/>
+            </m:dPr>
+            <m:e>
+              <m:r>
+                <m:t xml:space="preserve">α ⋅ ΔT</m:t>
+              </m:r>
+            </m:e>
+          </m:d>
+          <m:r>
+            <m:t xml:space="preserve"> ⋅ </m:t>
+          </m:r>
+          <m:d>
+            <m:dPr>
+              <m:begChr m:val="("/>
+              <m:endChr m:val=")"/>
+            </m:dPr>
+            <m:e>
+              <m:r>
+                <m:t xml:space="preserve">1 + β ⋅ </m:t>
+              </m:r>
+              <m:sSub>
+                <m:e>
+                  <m:r>
+                    <m:t xml:space="preserve">I</m:t>
+                  </m:r>
+                </m:e>
+                <m:sub>
+                  <m:r>
+                    <m:t xml:space="preserve">bg</m:t>
+                  </m:r>
+                </m:sub>
+              </m:sSub>
+            </m:e>
+          </m:d>
+        </m:oMath>
+      </m:oMathPara>
       <w:r>
-        <w:t xml:space="preserve">    λ_noise(T, I_bg) = I_dark,ref · exp(α·ΔT) · (1 + β·I_bg),</w:t>
+        <w:rPr>
+          <w:sz w:val="24"/>
+        </w:rPr>
+        <w:t xml:space="preserve">    (1)</w:t>
       </w:r>
     </w:p>
     <w:p>
@@ -488,15 +585,223 @@
     <w:p>
       <w:pPr/>
       <w:r>
-        <w:t>Let α denote the noise model accuracy: α = 1 − ||ê_noise − e_noise,true|| / ||e_noise,true||. The residual noise level after subtraction is σ_residual = (1−α)·σ_original, yielding an SNR improvement ratio:</w:t>
+        <w:t>Let α denote the noise model accuracy:</w:t>
       </w:r>
     </w:p>
     <w:p>
       <w:pPr>
-        <w:spacing w:after="120" w:before="120"/>
+        <w:spacing w:before="160" w:after="160"/>
       </w:pPr>
+      <m:oMathPara>
+        <m:oMath>
+          <m:r>
+            <m:t xml:space="preserve">α = 1 − </m:t>
+          </m:r>
+          <m:f>
+            <m:num>
+              <m:r>
+                <m:t xml:space="preserve">‖</m:t>
+              </m:r>
+              <m:acc>
+                <m:accPr>
+                  <m:chr m:val="̂"/>
+                </m:accPr>
+                <m:e>
+                  <m:r>
+                    <m:t xml:space="preserve">e</m:t>
+                  </m:r>
+                </m:e>
+              </m:acc>
+              <m:sSub>
+                <m:e>
+                  <m:r>
+                    <m:t xml:space="preserve"/>
+                  </m:r>
+                </m:e>
+                <m:sub>
+                  <m:r>
+                    <m:t xml:space="preserve">noise</m:t>
+                  </m:r>
+                </m:sub>
+              </m:sSub>
+              <m:r>
+                <m:t xml:space="preserve"> − </m:t>
+              </m:r>
+              <m:sSub>
+                <m:e>
+                  <m:r>
+                    <m:t xml:space="preserve">e</m:t>
+                  </m:r>
+                </m:e>
+                <m:sub>
+                  <m:r>
+                    <m:t xml:space="preserve">noise,true</m:t>
+                  </m:r>
+                </m:sub>
+              </m:sSub>
+              <m:r>
+                <m:t xml:space="preserve">‖</m:t>
+              </m:r>
+            </m:num>
+            <m:den>
+              <m:r>
+                <m:t xml:space="preserve">‖</m:t>
+              </m:r>
+              <m:sSub>
+                <m:e>
+                  <m:r>
+                    <m:t xml:space="preserve">e</m:t>
+                  </m:r>
+                </m:e>
+                <m:sub>
+                  <m:r>
+                    <m:t xml:space="preserve">noise,true</m:t>
+                  </m:r>
+                </m:sub>
+              </m:sSub>
+              <m:r>
+                <m:t xml:space="preserve">‖</m:t>
+              </m:r>
+            </m:den>
+          </m:f>
+        </m:oMath>
+      </m:oMathPara>
       <w:r>
-        <w:t xml:space="preserve">    SNR_after / SNR_before = 1 / (1 − α).</w:t>
+        <w:rPr>
+          <w:sz w:val="24"/>
+        </w:rPr>
+        <w:t xml:space="preserve">    (2)</w:t>
+      </w:r>
+    </w:p>
+    <w:p>
+      <w:pPr/>
+      <w:r>
+        <w:t>The residual noise level after subtraction is:</w:t>
+      </w:r>
+    </w:p>
+    <w:p>
+      <w:pPr>
+        <w:spacing w:before="160" w:after="160"/>
+      </w:pPr>
+      <m:oMathPara>
+        <m:oMath>
+          <m:sSub>
+            <m:e>
+              <m:r>
+                <m:t xml:space="preserve">σ</m:t>
+              </m:r>
+            </m:e>
+            <m:sub>
+              <m:r>
+                <m:t xml:space="preserve">residual</m:t>
+              </m:r>
+            </m:sub>
+          </m:sSub>
+          <m:r>
+            <m:t xml:space="preserve"> = </m:t>
+          </m:r>
+          <m:d>
+            <m:dPr>
+              <m:begChr m:val="("/>
+              <m:endChr m:val=")"/>
+            </m:dPr>
+            <m:e>
+              <m:r>
+                <m:t xml:space="preserve">1 − α</m:t>
+              </m:r>
+            </m:e>
+          </m:d>
+          <m:r>
+            <m:t xml:space="preserve"> ⋅ </m:t>
+          </m:r>
+          <m:sSub>
+            <m:e>
+              <m:r>
+                <m:t xml:space="preserve">σ</m:t>
+              </m:r>
+            </m:e>
+            <m:sub>
+              <m:r>
+                <m:t xml:space="preserve">original</m:t>
+              </m:r>
+            </m:sub>
+          </m:sSub>
+        </m:oMath>
+      </m:oMathPara>
+      <w:r>
+        <w:rPr>
+          <w:sz w:val="24"/>
+        </w:rPr>
+        <w:t xml:space="preserve">    (3)</w:t>
+      </w:r>
+    </w:p>
+    <w:p>
+      <w:pPr/>
+      <w:r>
+        <w:t>yielding an SNR improvement ratio:</w:t>
+      </w:r>
+    </w:p>
+    <w:p>
+      <w:pPr>
+        <w:spacing w:before="160" w:after="160"/>
+      </w:pPr>
+      <m:oMathPara>
+        <m:oMath>
+          <m:f>
+            <m:num>
+              <m:sSub>
+                <m:e>
+                  <m:r>
+                    <m:t xml:space="preserve">SNR</m:t>
+                  </m:r>
+                </m:e>
+                <m:sub>
+                  <m:r>
+                    <m:t xml:space="preserve">after</m:t>
+                  </m:r>
+                </m:sub>
+              </m:sSub>
+            </m:num>
+            <m:den>
+              <m:sSub>
+                <m:e>
+                  <m:r>
+                    <m:t xml:space="preserve">SNR</m:t>
+                  </m:r>
+                </m:e>
+                <m:sub>
+                  <m:r>
+                    <m:t xml:space="preserve">before</m:t>
+                  </m:r>
+                </m:sub>
+              </m:sSub>
+            </m:den>
+          </m:f>
+          <m:r>
+            <m:t xml:space="preserve"> = </m:t>
+          </m:r>
+          <m:f>
+            <m:num>
+              <m:r>
+                <m:rPr>
+                  <m:sty m:val="p"/>
+                </m:rPr>
+                <m:t xml:space="preserve">1</m:t>
+              </m:r>
+            </m:num>
+            <m:den>
+              <m:r>
+                <m:t xml:space="preserve">1 − α</m:t>
+              </m:r>
+            </m:den>
+          </m:f>
+        </m:oMath>
+      </m:oMathPara>
+      <w:r>
+        <w:rPr>
+          <w:sz w:val="24"/>
+        </w:rPr>
+        <w:t xml:space="preserve">    (4)</w:t>
       </w:r>
     </w:p>
     <w:p>
@@ -584,13 +889,201 @@
         <w:t>16</w:t>
       </w:r>
       <w:r>
-        <w:t xml:space="preserve"> to obtain per-pixel parameter maps via MAP estimation: θ̂ = argmax_θ p(e_cal|θ)·p(θ|θ_prior).</w:t>
+        <w:t xml:space="preserve"> to obtain per-pixel parameter maps via MAP estimation:</w:t>
+      </w:r>
+    </w:p>
+    <w:p>
+      <w:pPr>
+        <w:spacing w:before="160" w:after="160"/>
+      </w:pPr>
+      <m:oMathPara>
+        <m:oMath>
+          <m:acc>
+            <m:accPr>
+              <m:chr m:val="̂"/>
+            </m:accPr>
+            <m:e>
+              <m:r>
+                <m:t xml:space="preserve">θ</m:t>
+              </m:r>
+            </m:e>
+          </m:acc>
+          <m:r>
+            <m:t xml:space="preserve"> = </m:t>
+          </m:r>
+          <m:sSub>
+            <m:e>
+              <m:r>
+                <m:t xml:space="preserve">argmax</m:t>
+              </m:r>
+            </m:e>
+            <m:sub>
+              <m:r>
+                <m:t xml:space="preserve">θ</m:t>
+              </m:r>
+            </m:sub>
+          </m:sSub>
+          <m:r>
+            <m:t xml:space="preserve"> p</m:t>
+          </m:r>
+          <m:d>
+            <m:dPr>
+              <m:begChr m:val="("/>
+              <m:endChr m:val=")"/>
+            </m:dPr>
+            <m:e>
+              <m:sSub>
+                <m:e>
+                  <m:r>
+                    <m:t xml:space="preserve">e</m:t>
+                  </m:r>
+                </m:e>
+                <m:sub>
+                  <m:r>
+                    <m:t xml:space="preserve">cal</m:t>
+                  </m:r>
+                </m:sub>
+              </m:sSub>
+              <m:r>
+                <m:t xml:space="preserve"> | θ</m:t>
+              </m:r>
+            </m:e>
+          </m:d>
+          <m:r>
+            <m:t xml:space="preserve"> ⋅ p</m:t>
+          </m:r>
+          <m:d>
+            <m:dPr>
+              <m:begChr m:val="("/>
+              <m:endChr m:val=")"/>
+            </m:dPr>
+            <m:e>
+              <m:r>
+                <m:t xml:space="preserve">θ | </m:t>
+              </m:r>
+              <m:sSub>
+                <m:e>
+                  <m:r>
+                    <m:t xml:space="preserve">θ</m:t>
+                  </m:r>
+                </m:e>
+                <m:sub>
+                  <m:r>
+                    <m:t xml:space="preserve">prior</m:t>
+                  </m:r>
+                </m:sub>
+              </m:sSub>
+            </m:e>
+          </m:d>
+        </m:oMath>
+      </m:oMathPara>
+      <w:r>
+        <w:rPr>
+          <w:sz w:val="24"/>
+        </w:rPr>
+        <w:t xml:space="preserve">    (5)</w:t>
       </w:r>
     </w:p>
     <w:p>
       <w:pPr/>
       <w:r>
-        <w:t>Phase 2: Online inference (real-time). A Physics-Informed Neural Network predicts per-pixel noise rates: λ̂_noise(x,y,t) = NN_PI(θ_pixel_map, aux(t); W). The network comprises three layers: (a) Physics model layer (fixed weights, A5 model baseline), (b) Auxiliary-channel coupling layer (MLP [64-32-1] learning non-stationary variations), (c) Spatio-temporal correlation layer (Conv2D 3×3 learning inter-pixel noise correlations). Output: λ̂_noise = λ_physics · (1 + Δλ_aux) + Δλ_corr.</w:t>
+        <w:t>Phase 2: Online inference (real-time). A Physics-Informed Neural Network predicts per-pixel noise rates. The network comprises three layers: (a) Physics model layer (fixed weights, A5 model baseline), (b) Auxiliary-channel coupling layer (MLP [64-32-1] learning non-stationary variations), (c) Spatio-temporal correlation layer (Conv2D 3×3 learning inter-pixel noise correlations). Output:</w:t>
+      </w:r>
+    </w:p>
+    <w:p>
+      <w:pPr>
+        <w:spacing w:before="160" w:after="160"/>
+      </w:pPr>
+      <m:oMathPara>
+        <m:oMath>
+          <m:acc>
+            <m:accPr>
+              <m:chr m:val="̂"/>
+            </m:accPr>
+            <m:e>
+              <m:r>
+                <m:t xml:space="preserve">λ</m:t>
+              </m:r>
+            </m:e>
+          </m:acc>
+          <m:r>
+            <m:t xml:space="preserve"/>
+          </m:r>
+          <m:sSub>
+            <m:e>
+              <m:r>
+                <m:t xml:space="preserve"/>
+              </m:r>
+            </m:e>
+            <m:sub>
+              <m:r>
+                <m:t xml:space="preserve">noise</m:t>
+              </m:r>
+            </m:sub>
+          </m:sSub>
+          <m:r>
+            <m:t xml:space="preserve"> = </m:t>
+          </m:r>
+          <m:sSub>
+            <m:e>
+              <m:r>
+                <m:t xml:space="preserve">λ</m:t>
+              </m:r>
+            </m:e>
+            <m:sub>
+              <m:r>
+                <m:t xml:space="preserve">physics</m:t>
+              </m:r>
+            </m:sub>
+          </m:sSub>
+          <m:r>
+            <m:t xml:space="preserve"> ⋅ </m:t>
+          </m:r>
+          <m:d>
+            <m:dPr>
+              <m:begChr m:val="("/>
+              <m:endChr m:val=")"/>
+            </m:dPr>
+            <m:e>
+              <m:r>
+                <m:t xml:space="preserve">1 + Δ</m:t>
+              </m:r>
+              <m:sSub>
+                <m:e>
+                  <m:r>
+                    <m:t xml:space="preserve">λ</m:t>
+                  </m:r>
+                </m:e>
+                <m:sub>
+                  <m:r>
+                    <m:t xml:space="preserve">aux</m:t>
+                  </m:r>
+                </m:sub>
+              </m:sSub>
+            </m:e>
+          </m:d>
+          <m:r>
+            <m:t xml:space="preserve"> + Δ</m:t>
+          </m:r>
+          <m:sSub>
+            <m:e>
+              <m:r>
+                <m:t xml:space="preserve">λ</m:t>
+              </m:r>
+            </m:e>
+            <m:sub>
+              <m:r>
+                <m:t xml:space="preserve">corr</m:t>
+              </m:r>
+            </m:sub>
+          </m:sSub>
+        </m:oMath>
+      </m:oMathPara>
+      <w:r>
+        <w:rPr>
+          <w:sz w:val="24"/>
+        </w:rPr>
+        <w:t xml:space="preserve">    (6)</w:t>
       </w:r>
     </w:p>
     <w:p>
@@ -611,10 +1104,277 @@
     </w:p>
     <w:p>
       <w:pPr>
-        <w:spacing w:after="120" w:before="120"/>
+        <w:spacing w:before="160" w:after="160"/>
       </w:pPr>
+      <m:oMathPara>
+        <m:oMath>
+          <m:sSub>
+            <m:e>
+              <m:r>
+                <m:t xml:space="preserve">P</m:t>
+              </m:r>
+            </m:e>
+            <m:sub>
+              <m:r>
+                <m:t xml:space="preserve">noise</m:t>
+              </m:r>
+            </m:sub>
+          </m:sSub>
+          <m:d>
+            <m:dPr>
+              <m:begChr m:val="("/>
+              <m:endChr m:val=")"/>
+            </m:dPr>
+            <m:e>
+              <m:sSub>
+                <m:e>
+                  <m:r>
+                    <m:t xml:space="preserve">e</m:t>
+                  </m:r>
+                </m:e>
+                <m:sub>
+                  <m:r>
+                    <m:t xml:space="preserve">i</m:t>
+                  </m:r>
+                </m:sub>
+              </m:sSub>
+            </m:e>
+          </m:d>
+          <m:r>
+            <m:t xml:space="preserve"> = </m:t>
+          </m:r>
+          <m:f>
+            <m:num>
+              <m:acc>
+                <m:accPr>
+                  <m:chr m:val="̂"/>
+                </m:accPr>
+                <m:e>
+                  <m:r>
+                    <m:t xml:space="preserve">λ</m:t>
+                  </m:r>
+                </m:e>
+              </m:acc>
+              <m:sSub>
+                <m:e>
+                  <m:r>
+                    <m:t xml:space="preserve"/>
+                  </m:r>
+                </m:e>
+                <m:sub>
+                  <m:r>
+                    <m:t xml:space="preserve">noise</m:t>
+                  </m:r>
+                </m:sub>
+              </m:sSub>
+              <m:d>
+                <m:dPr>
+                  <m:begChr m:val="("/>
+                  <m:endChr m:val=")"/>
+                </m:dPr>
+                <m:e>
+                  <m:sSub>
+                    <m:e>
+                      <m:r>
+                        <m:t xml:space="preserve">x</m:t>
+                      </m:r>
+                    </m:e>
+                    <m:sub>
+                      <m:r>
+                        <m:t xml:space="preserve">i</m:t>
+                      </m:r>
+                    </m:sub>
+                  </m:sSub>
+                  <m:r>
+                    <m:t xml:space="preserve">, </m:t>
+                  </m:r>
+                  <m:sSub>
+                    <m:e>
+                      <m:r>
+                        <m:t xml:space="preserve">y</m:t>
+                      </m:r>
+                    </m:e>
+                    <m:sub>
+                      <m:r>
+                        <m:t xml:space="preserve">i</m:t>
+                      </m:r>
+                    </m:sub>
+                  </m:sSub>
+                  <m:r>
+                    <m:t xml:space="preserve">, </m:t>
+                  </m:r>
+                  <m:sSub>
+                    <m:e>
+                      <m:r>
+                        <m:t xml:space="preserve">t</m:t>
+                      </m:r>
+                    </m:e>
+                    <m:sub>
+                      <m:r>
+                        <m:t xml:space="preserve">i</m:t>
+                      </m:r>
+                    </m:sub>
+                  </m:sSub>
+                </m:e>
+              </m:d>
+            </m:num>
+            <m:den>
+              <m:acc>
+                <m:accPr>
+                  <m:chr m:val="̂"/>
+                </m:accPr>
+                <m:e>
+                  <m:r>
+                    <m:t xml:space="preserve">λ</m:t>
+                  </m:r>
+                </m:e>
+              </m:acc>
+              <m:sSub>
+                <m:e>
+                  <m:r>
+                    <m:t xml:space="preserve"/>
+                  </m:r>
+                </m:e>
+                <m:sub>
+                  <m:r>
+                    <m:t xml:space="preserve">noise</m:t>
+                  </m:r>
+                </m:sub>
+              </m:sSub>
+              <m:d>
+                <m:dPr>
+                  <m:begChr m:val="("/>
+                  <m:endChr m:val=")"/>
+                </m:dPr>
+                <m:e>
+                  <m:sSub>
+                    <m:e>
+                      <m:r>
+                        <m:t xml:space="preserve">x</m:t>
+                      </m:r>
+                    </m:e>
+                    <m:sub>
+                      <m:r>
+                        <m:t xml:space="preserve">i</m:t>
+                      </m:r>
+                    </m:sub>
+                  </m:sSub>
+                  <m:r>
+                    <m:t xml:space="preserve">, </m:t>
+                  </m:r>
+                  <m:sSub>
+                    <m:e>
+                      <m:r>
+                        <m:t xml:space="preserve">y</m:t>
+                      </m:r>
+                    </m:e>
+                    <m:sub>
+                      <m:r>
+                        <m:t xml:space="preserve">i</m:t>
+                      </m:r>
+                    </m:sub>
+                  </m:sSub>
+                  <m:r>
+                    <m:t xml:space="preserve">, </m:t>
+                  </m:r>
+                  <m:sSub>
+                    <m:e>
+                      <m:r>
+                        <m:t xml:space="preserve">t</m:t>
+                      </m:r>
+                    </m:e>
+                    <m:sub>
+                      <m:r>
+                        <m:t xml:space="preserve">i</m:t>
+                      </m:r>
+                    </m:sub>
+                  </m:sSub>
+                </m:e>
+              </m:d>
+              <m:r>
+                <m:t xml:space="preserve"> + </m:t>
+              </m:r>
+              <m:acc>
+                <m:accPr>
+                  <m:chr m:val="̂"/>
+                </m:accPr>
+                <m:e>
+                  <m:r>
+                    <m:t xml:space="preserve">λ</m:t>
+                  </m:r>
+                </m:e>
+              </m:acc>
+              <m:sSub>
+                <m:e>
+                  <m:r>
+                    <m:t xml:space="preserve"/>
+                  </m:r>
+                </m:e>
+                <m:sub>
+                  <m:r>
+                    <m:t xml:space="preserve">signal</m:t>
+                  </m:r>
+                </m:sub>
+              </m:sSub>
+              <m:d>
+                <m:dPr>
+                  <m:begChr m:val="("/>
+                  <m:endChr m:val=")"/>
+                </m:dPr>
+                <m:e>
+                  <m:sSub>
+                    <m:e>
+                      <m:r>
+                        <m:t xml:space="preserve">x</m:t>
+                      </m:r>
+                    </m:e>
+                    <m:sub>
+                      <m:r>
+                        <m:t xml:space="preserve">i</m:t>
+                      </m:r>
+                    </m:sub>
+                  </m:sSub>
+                  <m:r>
+                    <m:t xml:space="preserve">, </m:t>
+                  </m:r>
+                  <m:sSub>
+                    <m:e>
+                      <m:r>
+                        <m:t xml:space="preserve">y</m:t>
+                      </m:r>
+                    </m:e>
+                    <m:sub>
+                      <m:r>
+                        <m:t xml:space="preserve">i</m:t>
+                      </m:r>
+                    </m:sub>
+                  </m:sSub>
+                  <m:r>
+                    <m:t xml:space="preserve">, </m:t>
+                  </m:r>
+                  <m:sSub>
+                    <m:e>
+                      <m:r>
+                        <m:t xml:space="preserve">t</m:t>
+                      </m:r>
+                    </m:e>
+                    <m:sub>
+                      <m:r>
+                        <m:t xml:space="preserve">i</m:t>
+                      </m:r>
+                    </m:sub>
+                  </m:sSub>
+                </m:e>
+              </m:d>
+            </m:den>
+          </m:f>
+        </m:oMath>
+      </m:oMathPara>
       <w:r>
-        <w:t xml:space="preserve">    P_noise(e_i) = λ̂_noise(x_i,y_i,t_i) / [λ̂_noise(x_i,y_i,t_i) + λ̂_signal(x_i,y_i,t_i)].</w:t>
+        <w:rPr>
+          <w:sz w:val="24"/>
+        </w:rPr>
+        <w:t xml:space="preserve">    (7)</w:t>
       </w:r>
     </w:p>
     <w:p>
@@ -645,10 +1405,84 @@
     </w:p>
     <w:p>
       <w:pPr>
-        <w:spacing w:after="120" w:before="120"/>
+        <w:spacing w:before="160" w:after="160"/>
       </w:pPr>
+      <m:oMathPara>
+        <m:oMath>
+          <m:r>
+            <m:t xml:space="preserve">F</m:t>
+          </m:r>
+          <m:r>
+            <m:rPr>
+              <m:sty m:val="p"/>
+            </m:rPr>
+            <m:t xml:space="preserve"> = </m:t>
+          </m:r>
+          <m:f>
+            <m:num>
+              <m:r>
+                <m:rPr>
+                  <m:sty m:val="p"/>
+                </m:rPr>
+                <m:t xml:space="preserve">Var</m:t>
+              </m:r>
+              <m:d>
+                <m:dPr>
+                  <m:begChr m:val="("/>
+                  <m:endChr m:val=")"/>
+                </m:dPr>
+                <m:e>
+                  <m:sSub>
+                    <m:e>
+                      <m:r>
+                        <m:t xml:space="preserve">N</m:t>
+                      </m:r>
+                    </m:e>
+                    <m:sub>
+                      <m:r>
+                        <m:t xml:space="preserve">k</m:t>
+                      </m:r>
+                    </m:sub>
+                  </m:sSub>
+                </m:e>
+              </m:d>
+            </m:num>
+            <m:den>
+              <m:r>
+                <m:rPr>
+                  <m:sty m:val="p"/>
+                </m:rPr>
+                <m:t xml:space="preserve">Mean</m:t>
+              </m:r>
+              <m:d>
+                <m:dPr>
+                  <m:begChr m:val="("/>
+                  <m:endChr m:val=")"/>
+                </m:dPr>
+                <m:e>
+                  <m:sSub>
+                    <m:e>
+                      <m:r>
+                        <m:t xml:space="preserve">N</m:t>
+                      </m:r>
+                    </m:e>
+                    <m:sub>
+                      <m:r>
+                        <m:t xml:space="preserve">k</m:t>
+                      </m:r>
+                    </m:sub>
+                  </m:sSub>
+                </m:e>
+              </m:d>
+            </m:den>
+          </m:f>
+        </m:oMath>
+      </m:oMathPara>
       <w:r>
-        <w:t xml:space="preserve">    F = Var(N_k) / Mean(N_k),</w:t>
+        <w:rPr>
+          <w:sz w:val="24"/>
+        </w:rPr>
+        <w:t xml:space="preserve">    (8)</w:t>
       </w:r>
     </w:p>
     <w:p>
@@ -1886,7 +2720,66 @@
         <w:t>25</w:t>
       </w:r>
       <w:r>
-        <w:t xml:space="preserve"> this could detect fast-moving faint objects (10–50 m near-Earth objects) beyond the reach of frame-based telescopes. The detection limit improvement scales as Δm ≈ 2.5 log₁₀(1/(1−α)), giving Δm &gt; 2.5 mag at α = 0.9.</w:t>
+        <w:t xml:space="preserve"> this could detect fast-moving faint objects (10–50 m near-Earth objects) beyond the reach of frame-based telescopes. The detection limit improvement scales as:</w:t>
+      </w:r>
+    </w:p>
+    <w:p>
+      <w:pPr>
+        <w:spacing w:before="160" w:after="160"/>
+      </w:pPr>
+      <m:oMathPara>
+        <m:oMath>
+          <m:r>
+            <m:t xml:space="preserve">Δm ≈ 2.5 </m:t>
+          </m:r>
+          <m:sSub>
+            <m:e>
+              <m:r>
+                <m:t xml:space="preserve">log</m:t>
+              </m:r>
+            </m:e>
+            <m:sub>
+              <m:r>
+                <m:t xml:space="preserve">10</m:t>
+              </m:r>
+            </m:sub>
+          </m:sSub>
+          <m:d>
+            <m:dPr>
+              <m:begChr m:val="("/>
+              <m:endChr m:val=")"/>
+            </m:dPr>
+            <m:e>
+              <m:f>
+                <m:num>
+                  <m:r>
+                    <m:rPr>
+                      <m:sty m:val="p"/>
+                    </m:rPr>
+                    <m:t xml:space="preserve">1</m:t>
+                  </m:r>
+                </m:num>
+                <m:den>
+                  <m:r>
+                    <m:t xml:space="preserve">1 − α</m:t>
+                  </m:r>
+                </m:den>
+              </m:f>
+            </m:e>
+          </m:d>
+        </m:oMath>
+      </m:oMathPara>
+      <w:r>
+        <w:rPr>
+          <w:sz w:val="24"/>
+        </w:rPr>
+        <w:t xml:space="preserve">    (9)</w:t>
+      </w:r>
+    </w:p>
+    <w:p>
+      <w:pPr/>
+      <w:r>
+        <w:t>giving Δm &gt; 2.5 mag at α = 0.9.</w:t>
       </w:r>
     </w:p>
     <w:p>

</xml_diff>